<commit_message>
kiem tra lai 3
</commit_message>
<xml_diff>
--- a/check/sotay_flow.docx
+++ b/check/sotay_flow.docx
@@ -349,7 +349,7 @@
               <w:bottom w:sz="6" w:val="single" w:color="999999"/>
               <w:end w:sz="6" w:val="single" w:color="999999"/>
             </w:tcBorders>
-            <w:shd w:fill="e8eefb"/>
+            <w:shd w:fill="e8eefb" w:val="clear"/>
             <w:tcMar>
               <w:start w:w="0" w:type="dxa"/>
               <w:end w:w="0" w:type="dxa"/>
@@ -385,7 +385,7 @@
               <w:bottom w:sz="6" w:val="single" w:color="999999"/>
               <w:end w:sz="6" w:val="single" w:color="999999"/>
             </w:tcBorders>
-            <w:shd w:fill="e8eefb"/>
+            <w:shd w:fill="e8eefb" w:val="clear"/>
             <w:tcMar>
               <w:start w:w="0" w:type="dxa"/>
               <w:end w:w="0" w:type="dxa"/>
@@ -421,7 +421,7 @@
               <w:bottom w:sz="6" w:val="single" w:color="999999"/>
               <w:end w:sz="6" w:val="single" w:color="999999"/>
             </w:tcBorders>
-            <w:shd w:fill="e8eefb"/>
+            <w:shd w:fill="e8eefb" w:val="clear"/>
             <w:tcMar>
               <w:start w:w="0" w:type="dxa"/>
               <w:end w:w="0" w:type="dxa"/>

</xml_diff>